<commit_message>
Update manuscript narrative artifacts
</commit_message>
<xml_diff>
--- a/manuscript_narrative/galaxy-oriented/supplementary/Supplementary_Note_1_interventions_and_conformance.docx
+++ b/manuscript_narrative/galaxy-oriented/supplementary/Supplementary_Note_1_interventions_and_conformance.docx
@@ -420,7 +420,21 @@
         <w:rPr>
           <w:rFonts w:ascii="Arial" w:cs="Arial" w:eastAsia="Arial" w:hAnsi="Arial"/>
         </w:rPr>
-        <w:t xml:space="preserve">The suite, its expected results and its scoring script are to be published with the intervention study.</w:t>
+        <w:t xml:space="preserve">The suite, its expected results and its scoring script are to be published with the intervention study. A first version is in </w:t>
+      </w:r>
+      <w:r>
+        <w:rPr>
+          <w:rFonts w:ascii="Courier New" w:cs="Courier New" w:eastAsia="Courier New" w:hAnsi="Courier New"/>
+          <w:sz w:val="20"/>
+          <w:szCs w:val="20"/>
+        </w:rPr>
+        <w:t xml:space="preserve">galaxy-oriented/conformance/</w:t>
+      </w:r>
+      <w:r>
+        <w:rPr>
+          <w:rFonts w:ascii="Arial" w:cs="Arial" w:eastAsia="Arial" w:hAnsi="Arial"/>
+        </w:rPr>
+        <w:t xml:space="preserve"> of the code release: 33 fixtures across R1–R6, five of them reproducing request shapes from archived bix-35-q1 job ledgers, with a scorer and a self-test in which reference responses pass and ten injected defects are each detected. It has not been run against any deployment, and its tool versions, images and output descriptions are frozen only at registration.</w:t>
       </w:r>
     </w:p>
     <w:p>

</xml_diff>